<commit_message>
docs(HCO v2): AAC policy fixes plus Records and SOPs package
</commit_message>
<xml_diff>
--- a/policies/build/chapters_v2/AAC/HCO_AAC_10_v2_REWRITE_DRAFT.docx
+++ b/policies/build/chapters_v2/AAC/HCO_AAC_10_v2_REWRITE_DRAFT.docx
@@ -829,6 +829,11 @@
       </w:tr>
     </w:tbl>
     <w:p>
+      <w:r>
+        <w:t>This policy is reviewed annually, or sooner if NABH standards change.</w:t>
+      </w:r>
+    </w:p>
+    <w:p>
       <w:pPr>
         <w:pStyle w:val="Heading1"/>
       </w:pPr>
@@ -1554,7 +1559,7 @@
     <w:p>
       <w:pPr/>
       <w:r>
-        <w:t>This policy reorganises the supplied AAC.10 objective-element wording and Guidebook interpretation into plain-language guidance for «Hospital Name». It does not replace the NABH Accreditation Standards for Hospitals, 6th Edition, or the Guidebook, which remain the authoritative source in case of any conflict.</w:t>
+        <w:t>This document is a template prepared for the guidance of «Hospital Name» and must be reviewed, adapted and formally approved by «Hospital Name» before use. Every entry marked ________ must be completed before the document is issued.</w:t>
       </w:r>
     </w:p>
     <w:p>
@@ -1566,13 +1571,13 @@
     <w:p>
       <w:pPr/>
       <w:r>
-        <w:t>This policy shall be reviewed at least once every year, or earlier if NABH standards change.</w:t>
+        <w:t>The clinical and technical content reflects recognised national and international guidance current at the date of preparation. «Hospital Name» remains responsible for verifying that it is current and consistent with the edition of the accreditation standard against which it is being assessed.</w:t>
       </w:r>
     </w:p>
     <w:p>
       <w:pPr/>
       <w:r>
-        <w:t>This policy is the property of «Hospital Name» and is not to be reproduced or distributed outside the organisation without authorisation.</w:t>
+        <w:t>This document is not issued by, endorsed by, or affiliated with NABH or any other body named in it. Wording is original; no text has been reproduced from the standards, rules or guidelines referenced.</w:t>
       </w:r>
     </w:p>
     <w:sectPr>

</xml_diff>